<commit_message>
audit logging, scheduled anchor job, /studies router, JWT secret fix
</commit_message>
<xml_diff>
--- a/AIIA_CTMS_Master_Context_v4_with_progress_log.docx
+++ b/AIIA_CTMS_Master_Context_v4_with_progress_log.docx
@@ -13898,14 +13898,180 @@
           <w:b/>
           <w:color w:val="C00000"/>
         </w:rPr>
-        <w:t>⚠ Security note — flag before the next commit or demo: the placeholder JWT_SECRET_KEY that run_backend.py writes into a freshly created .env is a fixed, hardcoded string in the script itself, not randomly generated per install. Anyone reading run_backend.py's source gets the same secret that a fresh teammate's .env would receive, which defeats the purpose of a signing secret (tokens could be forged). Recommend generating it with secrets.token_urlsafe(64) at .env-creation time instead of writing a literal constant. Separately, the .env file currently in the working copy holds the real Supabase database password and the real JWT_SECRET_KEY in plaintext — it is correctly listed in .gitignore and has not been committed</w:t>
-      </w:r>
+        <w:t>⚠ Security note — flag before the next commit or demo: the placeholder JWT_SECRET_KEY that run_backend.py writes into a freshly created .env is a fixed, hardcoded string in the script itself, not randomly generated per install. Anyone reading run_backend.py's source gets the same secret that a fresh teammate's .env would receive, which defeats the purpose of a signing secret (tokens could be forged). Recommend generating it with secrets.token_urlsafe(64) at .env-creation time instead of writing a literal constant. Separately, the .env file currently in the working copy holds the real Supabase database password and the real JWT_SECRET_KEY in plaintext — it is correctly listed in .gitignore and has not been committed.</w:t>
+      </w:r>
+    </w:p>
+    <w:p>
+      <w:pPr>
+        <w:spacing w:after="120" w:before="200"/>
+      </w:pPr>
       <w:r>
         <w:rPr>
           <w:b/>
-          <w:color w:val="C00000"/>
-        </w:rPr>
-        <w:t>.</w:t>
+          <w:sz w:val="24"/>
+          <w:szCs w:val="24"/>
+        </w:rPr>
+        <w:t xml:space="preserve">18.9 Session Log — JWT Secret Fix, Audit Logging on Login, Scheduled Merkle Job, /studies Router (this session)</w:t>
+      </w:r>
+    </w:p>
+    <w:p>
+      <w:pPr>
+        <w:spacing w:after="120"/>
+      </w:pPr>
+      <w:r>
+        <w:rPr>
+          <w:sz w:val="22"/>
+          <w:szCs w:val="22"/>
+        </w:rPr>
+        <w:t xml:space="preserve">Fixed the security issue flagged at the end of Section 18.7, then moved forward on the blockchain anchor layer (Section 8) and the Chunk 1 MVP router, picking up from Section 18.8's open items.</w:t>
+      </w:r>
+    </w:p>
+    <w:p>
+      <w:pPr>
+        <w:spacing w:after="100"/>
+        <w:ind w:left="360"/>
+      </w:pPr>
+      <w:r>
+        <w:rPr>
+          <w:b/>
+          <w:bCs/>
+          <w:color w:val="166534"/>
+          <w:sz w:val="22"/>
+          <w:szCs w:val="22"/>
+        </w:rPr>
+        <w:t xml:space="preserve">✓ DONE: run_backend.py's hardcoded JWT_SECRET_KEY fixed. create_env_file() now calls secrets.token_urlsafe(64) at the moment it writes a fresh .env, instead of writing a literal string from the script's source. Verified two separate simulated first-runs produce two different secrets, and that an already-existing .env is left untouched on rerun (not regenerated). Existing .env files created before this fix should be regenerated manually — their secret was effectively public.</w:t>
+      </w:r>
+    </w:p>
+    <w:p>
+      <w:pPr>
+        <w:spacing w:after="100"/>
+        <w:ind w:left="360"/>
+      </w:pPr>
+      <w:r>
+        <w:rPr>
+          <w:b/>
+          <w:bCs/>
+          <w:color w:val="166534"/>
+          <w:sz w:val="22"/>
+          <w:szCs w:val="22"/>
+        </w:rPr>
+        <w:t xml:space="preserve">✓ DONE: app/audit_log.py wired into POST /auth/login. Every successful login now writes a hash-chained LOGIN row to audit_trail (entity_type=user, entity_id=the user's id). Failed login attempts are deliberately not logged, since distinguishing a wrong password from a nonexistent email in an audit row would leak exactly what the identical 401 error message is designed to hide. Verified by calling the real login() function against an in-memory DB: one login produced exactly one 64-char hex row_hash; a second login produced a second row whose hash correctly differed (proving the chain); compute_merkle_root() ran cleanly over both.</w:t>
+      </w:r>
+    </w:p>
+    <w:p>
+      <w:pPr>
+        <w:spacing w:after="100"/>
+        <w:ind w:left="360"/>
+      </w:pPr>
+      <w:r>
+        <w:rPr>
+          <w:b/>
+          <w:bCs/>
+          <w:color w:val="166534"/>
+          <w:sz w:val="22"/>
+          <w:szCs w:val="22"/>
+        </w:rPr>
+        <w:t xml:space="preserve">✓ DONE: Scheduled Merkle commit job (Section 13 Day 5). Refactored the batch/compute/commit logic out of POST /audit/anchor into a shared app/anchor_job.py:run_anchor_once(), so the manual endpoint and the new scheduler can never drift apart. app/scheduler.py runs it on a timer via APScheduler (ANCHOR_INTERVAL_MINUTES env var, defaults to 15), started/stopped through FastAPI's lifespan. Verified the scheduler actually starts and registers the job on app startup and shuts down cleanly on exit, and separately verified the job catches an unconfigured-RPC failure (PRIVATE_KEY not set) and logs it instead of crashing the background thread. Add apscheduler==3.11.3 to requirements.txt.</w:t>
+      </w:r>
+    </w:p>
+    <w:p>
+      <w:pPr>
+        <w:spacing w:after="100"/>
+        <w:ind w:left="360"/>
+      </w:pPr>
+      <w:r>
+        <w:rPr>
+          <w:b/>
+          <w:bCs/>
+          <w:color w:val="166534"/>
+          <w:sz w:val="22"/>
+          <w:szCs w:val="22"/>
+        </w:rPr>
+        <w:t xml:space="preserve">✓ DONE: /studies router built (Chunk 1, MVP build priority). GET /studies (list, scoped so a PI only sees their own studies), GET /studies/{id} (full detail with computed enrollment_percent and a milestone list flagging overdue ones), POST /studies (pi or admin only; new studies start at status=pending_iec, the first of Section 10's seven lifecycle stages). Every CREATE writes to audit_trail via the same log_action() helper used by login. Verified end to end against an in-memory DB: created a study as a PI, bumped enrollment to 60/100 and confirmed enrollment_percent computed to exactly 60.0, added one 5-days-overdue and one future milestone and confirmed overdue_milestone_count came back as 1, confirmed a different PI got a real 403 on the same study, confirmed admin's list included it while an unrelated PI's list did not, and confirmed the CREATE audit row landed correctly.</w:t>
+      </w:r>
+    </w:p>
+    <w:p>
+      <w:pPr>
+        <w:spacing w:after="120"/>
+        <w:ind w:left="360"/>
+      </w:pPr>
+      <w:r>
+        <w:rPr>
+          <w:b/>
+          <w:bCs/>
+          <w:color w:val="991B1B"/>
+          <w:sz w:val="22"/>
+          <w:szCs w:val="22"/>
+        </w:rPr>
+        <w:t xml:space="preserve">⚠ Known scope gap, not silently claimed as done: the locked schema (Section 7) only has a single principal_investigator_id FK on research_study — there is no coordinator/monitor/EC/PV assignment table. "Assigned study only" (Section 4's Coordinator/Monitor row) can't be enforced at the query level yet; those roles currently see every study, same as admin/regulator. Would need a study_team join table to fix properly, and that table isn't in the locked schema — flag this if a judge asks, or revisit if there's time.</w:t>
+      </w:r>
+    </w:p>
+    <w:p>
+      <w:pPr>
+        <w:spacing w:after="120" w:before="200"/>
+      </w:pPr>
+      <w:r>
+        <w:rPr>
+          <w:b/>
+          <w:sz w:val="24"/>
+          <w:szCs w:val="24"/>
+        </w:rPr>
+        <w:t xml:space="preserve">18.10 What is NOT done yet — pick up here</w:t>
+      </w:r>
+    </w:p>
+    <w:p>
+      <w:pPr>
+        <w:numPr>
+          <w:ilvl w:val="0"/>
+          <w:numId w:val="1"/>
+        </w:numPr>
+      </w:pPr>
+      <w:r>
+        <w:t xml:space="preserve">Deploy AuditAnchor.sol to Polygon Amoy testnet via Hardhat (needs a funded testnet wallet + RPC endpoint — see hardhat/README.md), then set AMOY_RPC_URL, PRIVATE_KEY, CONTRACT_ADDRESS in the backend's .env. Nothing on the blockchain side can actually run end to end until this is done.</w:t>
+      </w:r>
+    </w:p>
+    <w:p>
+      <w:pPr>
+        <w:numPr>
+          <w:ilvl w:val="0"/>
+          <w:numId w:val="1"/>
+        </w:numPr>
+      </w:pPr>
+      <w:r>
+        <w:t xml:space="preserve">Once deployed: run python -m app.seed_test_users, log in as each of the 7 roles to generate real audit_trail rows, then call POST /audit/anchor once manually and confirm GET /audit/verify returns matched — closes the loop with real data before relying on the scheduler alone.</w:t>
+      </w:r>
+    </w:p>
+    <w:p>
+      <w:pPr>
+        <w:numPr>
+          <w:ilvl w:val="0"/>
+          <w:numId w:val="1"/>
+        </w:numPr>
+      </w:pPr>
+      <w:r>
+        <w:t xml:space="preserve">Wire log_action() into whatever routes get built next (patients, AE, visit logs, milestones) — currently only login and study CREATE write to audit_trail.</w:t>
+      </w:r>
+    </w:p>
+    <w:p>
+      <w:pPr>
+        <w:numPr>
+          <w:ilvl w:val="0"/>
+          <w:numId w:val="1"/>
+        </w:numPr>
+      </w:pPr>
+      <w:r>
+        <w:t xml:space="preserve">Synthetic seed data: 7 studies at different lifecycle stages, per Section 10 — not started.</w:t>
+      </w:r>
+    </w:p>
+    <w:p>
+      <w:pPr>
+        <w:numPr>
+          <w:ilvl w:val="0"/>
+          <w:numId w:val="1"/>
+        </w:numPr>
+      </w:pPr>
+      <w:r>
+        <w:t xml:space="preserve">/patients, /ae, /visits, /audit trail UI, and everything else in Section 13's Day 1-7 plan beyond auth, studies, and the anchor layer.</w:t>
       </w:r>
     </w:p>
     <w:sectPr>

</xml_diff>